<commit_message>
Restyle administrative document templates
</commit_message>
<xml_diff>
--- a/forms/01_공개자료_조사_비교_보고서.docx
+++ b/forms/01_공개자료_조사_비교_보고서.docx
@@ -4,140 +4,249 @@
   <w:body>
     <w:p>
       <w:pPr>
-        <w:spacing w:after="20"/>
+        <w:jc w:val="right"/>
       </w:pPr>
       <w:r>
         <w:rPr>
           <w:rFonts w:ascii="Malgun Gothic" w:hAnsi="Malgun Gothic" w:eastAsia="Malgun Gothic"/>
           <w:b/>
-          <w:color w:val="07509F"/>
-          <w:sz w:val="18"/>
+          <w:sz w:val="24"/>
         </w:rPr>
-        <w:t>AI 업무 워크플로우 실습 양식</w:t>
+        <w:t>서울시립대학교</w:t>
       </w:r>
     </w:p>
     <w:p>
       <w:pPr>
-        <w:spacing w:after="80"/>
+        <w:spacing w:before="80" w:after="260"/>
+        <w:jc w:val="center"/>
       </w:pPr>
       <w:r>
         <w:rPr>
           <w:rFonts w:ascii="Malgun Gothic" w:hAnsi="Malgun Gothic" w:eastAsia="Malgun Gothic"/>
           <w:b/>
-          <w:color w:val="06366F"/>
-          <w:sz w:val="42"/>
+          <w:sz w:val="30"/>
         </w:rPr>
-        <w:t>공개자료 조사·비교 보고서</w:t>
+        <w:t>[보고] ○○ 공개자료 조사·비교 결과</w:t>
       </w:r>
     </w:p>
     <w:p>
       <w:pPr>
-        <w:spacing w:after="240"/>
+        <w:spacing w:after="40"/>
       </w:pPr>
       <w:r>
         <w:rPr>
           <w:rFonts w:ascii="Malgun Gothic" w:hAnsi="Malgun Gothic" w:eastAsia="Malgun Gothic"/>
-          <w:color w:val="51687F"/>
-          <w:sz w:val="20"/>
+          <w:b/>
+          <w:sz w:val="21"/>
         </w:rPr>
-        <w:t>공개 공고·규정·운영 사례를 비교하고, 활용 가능한 사실과 확인 과제를 정리합니다.</w:t>
+        <w:t xml:space="preserve">보고일자  </w:t>
+      </w:r>
+      <w:r>
+        <w:rPr>
+          <w:rFonts w:ascii="Malgun Gothic" w:hAnsi="Malgun Gothic" w:eastAsia="Malgun Gothic"/>
+          <w:b w:val="0"/>
+          <w:sz w:val="21"/>
+        </w:rPr>
+        <w:t>20○○. ○. ○.</w:t>
+      </w:r>
+    </w:p>
+    <w:p>
+      <w:pPr>
+        <w:spacing w:after="40"/>
+      </w:pPr>
+      <w:r>
+        <w:rPr>
+          <w:rFonts w:ascii="Malgun Gothic" w:hAnsi="Malgun Gothic" w:eastAsia="Malgun Gothic"/>
+          <w:b/>
+          <w:sz w:val="21"/>
+        </w:rPr>
+        <w:t xml:space="preserve">보고자  </w:t>
+      </w:r>
+      <w:r>
+        <w:rPr>
+          <w:rFonts w:ascii="Malgun Gothic" w:hAnsi="Malgun Gothic" w:eastAsia="Malgun Gothic"/>
+          <w:b w:val="0"/>
+          <w:sz w:val="21"/>
+        </w:rPr>
+        <w:t>○○과 ○○○</w:t>
+      </w:r>
+    </w:p>
+    <w:p>
+      <w:pPr>
+        <w:spacing w:after="40"/>
+      </w:pPr>
+      <w:r>
+        <w:rPr>
+          <w:rFonts w:ascii="Malgun Gothic" w:hAnsi="Malgun Gothic" w:eastAsia="Malgun Gothic"/>
+          <w:b/>
+          <w:sz w:val="21"/>
+        </w:rPr>
+        <w:t xml:space="preserve">조사 범위  </w:t>
+      </w:r>
+      <w:r>
+        <w:rPr>
+          <w:rFonts w:ascii="Malgun Gothic" w:hAnsi="Malgun Gothic" w:eastAsia="Malgun Gothic"/>
+          <w:b w:val="0"/>
+          <w:sz w:val="21"/>
+        </w:rPr>
+        <w:t>○○대학교 등 ○개 기관의 공개 공고·규정·안내문</w:t>
+      </w:r>
+    </w:p>
+    <w:p>
+      <w:pPr>
+        <w:spacing w:after="60"/>
+        <w:ind w:left="0"/>
+      </w:pPr>
+      <w:r>
+        <w:rPr>
+          <w:rFonts w:ascii="Malgun Gothic" w:hAnsi="Malgun Gothic" w:eastAsia="Malgun Gothic"/>
+          <w:b/>
+          <w:sz w:val="21"/>
+        </w:rPr>
+        <w:t>1. 조사 개요</w:t>
+      </w:r>
+    </w:p>
+    <w:p>
+      <w:pPr>
+        <w:spacing w:after="60"/>
+        <w:ind w:left="259"/>
+      </w:pPr>
+      <w:r>
+        <w:rPr>
+          <w:rFonts w:ascii="Malgun Gothic" w:hAnsi="Malgun Gothic" w:eastAsia="Malgun Gothic"/>
+          <w:b w:val="0"/>
+          <w:sz w:val="21"/>
+        </w:rPr>
+        <w:t xml:space="preserve">  가. 조사 목적: ○○ 업무 추진에 필요한 공개 기준 및 운영사례 확인</w:t>
+      </w:r>
+    </w:p>
+    <w:p>
+      <w:pPr>
+        <w:spacing w:after="60"/>
+        <w:ind w:left="259"/>
+      </w:pPr>
+      <w:r>
+        <w:rPr>
+          <w:rFonts w:ascii="Malgun Gothic" w:hAnsi="Malgun Gothic" w:eastAsia="Malgun Gothic"/>
+          <w:b w:val="0"/>
+          <w:sz w:val="21"/>
+        </w:rPr>
+        <w:t xml:space="preserve">  나. 기준일: 20○○. ○. ○. 현재</w:t>
+      </w:r>
+    </w:p>
+    <w:p>
+      <w:pPr>
+        <w:spacing w:after="60"/>
+        <w:ind w:left="0"/>
+      </w:pPr>
+      <w:r>
+        <w:rPr>
+          <w:rFonts w:ascii="Malgun Gothic" w:hAnsi="Malgun Gothic" w:eastAsia="Malgun Gothic"/>
+          <w:b/>
+          <w:sz w:val="21"/>
+        </w:rPr>
+        <w:t>2. 주요 조사 결과</w:t>
       </w:r>
     </w:p>
     <w:tbl>
       <w:tblPr>
         <w:tblW w:type="auto" w:w="0"/>
-        <w:jc w:val="left"/>
+        <w:jc w:val="center"/>
         <w:tblLayout w:type="fixed"/>
         <w:tblLook w:firstColumn="1" w:firstRow="1" w:lastColumn="0" w:lastRow="0" w:noHBand="0" w:noVBand="1" w:val="04A0"/>
+        <w:tblBorders>
+          <w:top w:val="single" w:sz="4" w:color="808080"/>
+          <w:left w:val="single" w:sz="4" w:color="808080"/>
+          <w:bottom w:val="single" w:sz="4" w:color="808080"/>
+          <w:right w:val="single" w:sz="4" w:color="808080"/>
+          <w:insideH w:val="single" w:sz="4" w:color="808080"/>
+          <w:insideV w:val="single" w:sz="4" w:color="808080"/>
+        </w:tblBorders>
       </w:tblPr>
       <w:tblGrid>
-        <w:gridCol w:w="9360"/>
+        <w:gridCol w:w="2469"/>
+        <w:gridCol w:w="2469"/>
+        <w:gridCol w:w="2469"/>
+        <w:gridCol w:w="2469"/>
       </w:tblGrid>
       <w:tr>
         <w:tc>
           <w:tcPr>
-            <w:tcW w:type="dxa" w:w="9360"/>
+            <w:tcW w:type="dxa" w:w="792"/>
+            <w:shd w:fill="E7E6E6"/>
             <w:vAlign w:val="center"/>
-            <w:shd w:fill="EAF3FB"/>
           </w:tcPr>
           <w:p>
             <w:pPr>
-              <w:spacing w:after="60" w:before="60"/>
-              <w:jc w:val="left"/>
+              <w:jc w:val="center"/>
             </w:pPr>
             <w:r>
               <w:rPr>
                 <w:rFonts w:ascii="Malgun Gothic" w:hAnsi="Malgun Gothic" w:eastAsia="Malgun Gothic"/>
                 <w:b/>
-                <w:color w:val="315A80"/>
-                <w:sz w:val="18"/>
+                <w:sz w:val="19"/>
               </w:rPr>
-              <w:t>작성 원칙  |  Perplexity·Liner에서 수집한 공개 URL·게시일·기준일을 먼저 붙여 넣고, 확인되지 않은 내용은 [담당자 확인 필요]로 표시합니다.</w:t>
+              <w:t>구분</w:t>
             </w:r>
           </w:p>
         </w:tc>
-      </w:tr>
-    </w:tbl>
-    <w:p>
-      <w:pPr>
-        <w:pStyle w:val="Heading1"/>
-      </w:pPr>
-      <w:r>
-        <w:t>1. 조사 개요</w:t>
-      </w:r>
-    </w:p>
-    <w:tbl>
-      <w:tblPr>
-        <w:tblW w:type="auto" w:w="0"/>
-        <w:jc w:val="left"/>
-        <w:tblLayout w:type="fixed"/>
-        <w:tblLook w:firstColumn="1" w:firstRow="1" w:lastColumn="0" w:lastRow="0" w:noHBand="0" w:noVBand="1" w:val="04A0"/>
-      </w:tblPr>
-      <w:tblGrid>
-        <w:gridCol w:w="2600"/>
-        <w:gridCol w:w="6760"/>
-      </w:tblGrid>
-      <w:tr>
         <w:tc>
           <w:tcPr>
-            <w:tcW w:type="dxa" w:w="2600"/>
-            <w:shd w:fill="F2F4F7"/>
+            <w:tcW w:type="dxa" w:w="2880"/>
+            <w:shd w:fill="E7E6E6"/>
             <w:vAlign w:val="center"/>
           </w:tcPr>
           <w:p>
             <w:pPr>
-              <w:spacing w:after="60" w:before="60"/>
-              <w:jc w:val="left"/>
+              <w:jc w:val="center"/>
             </w:pPr>
             <w:r>
               <w:rPr>
                 <w:rFonts w:ascii="Malgun Gothic" w:hAnsi="Malgun Gothic" w:eastAsia="Malgun Gothic"/>
                 <w:b/>
-                <w:color w:val="29465F"/>
                 <w:sz w:val="19"/>
               </w:rPr>
-              <w:t>조사 목적</w:t>
+              <w:t>기관·자료명</w:t>
             </w:r>
           </w:p>
         </w:tc>
         <w:tc>
           <w:tcPr>
-            <w:tcW w:type="dxa" w:w="6760"/>
+            <w:tcW w:type="dxa" w:w="3816"/>
+            <w:shd w:fill="E7E6E6"/>
             <w:vAlign w:val="center"/>
           </w:tcPr>
           <w:p>
             <w:pPr>
-              <w:spacing w:after="60" w:before="60"/>
-              <w:jc w:val="left"/>
+              <w:jc w:val="center"/>
             </w:pPr>
             <w:r>
               <w:rPr>
                 <w:rFonts w:ascii="Malgun Gothic" w:hAnsi="Malgun Gothic" w:eastAsia="Malgun Gothic"/>
-                <w:b w:val="0"/>
-                <w:color w:val="6A7D90"/>
+                <w:b/>
                 <w:sz w:val="19"/>
               </w:rPr>
-              <w:t>[예: 대학 수강신청 공개 안내 비교]</w:t>
+              <w:t>주요 내용</w:t>
+            </w:r>
+          </w:p>
+        </w:tc>
+        <w:tc>
+          <w:tcPr>
+            <w:tcW w:type="dxa" w:w="1728"/>
+            <w:shd w:fill="E7E6E6"/>
+            <w:vAlign w:val="center"/>
+          </w:tcPr>
+          <w:p>
+            <w:pPr>
+              <w:jc w:val="center"/>
+            </w:pPr>
+            <w:r>
+              <w:rPr>
+                <w:rFonts w:ascii="Malgun Gothic" w:hAnsi="Malgun Gothic" w:eastAsia="Malgun Gothic"/>
+                <w:b/>
+                <w:sz w:val="19"/>
+              </w:rPr>
+              <w:t>게시·수정일</w:t>
             </w:r>
           </w:p>
         </w:tc>
@@ -145,266 +254,17 @@
       <w:tr>
         <w:tc>
           <w:tcPr>
-            <w:tcW w:type="dxa" w:w="2600"/>
-            <w:shd w:fill="F2F4F7"/>
+            <w:tcW w:type="dxa" w:w="792"/>
             <w:vAlign w:val="center"/>
           </w:tcPr>
           <w:p>
             <w:pPr>
-              <w:spacing w:after="60" w:before="60"/>
-              <w:jc w:val="left"/>
-            </w:pPr>
-            <w:r>
-              <w:rPr>
-                <w:rFonts w:ascii="Malgun Gothic" w:hAnsi="Malgun Gothic" w:eastAsia="Malgun Gothic"/>
-                <w:b/>
-                <w:color w:val="29465F"/>
-                <w:sz w:val="19"/>
-              </w:rPr>
-              <w:t>조사 범위</w:t>
-            </w:r>
-          </w:p>
-        </w:tc>
-        <w:tc>
-          <w:tcPr>
-            <w:tcW w:type="dxa" w:w="6760"/>
-            <w:vAlign w:val="center"/>
-          </w:tcPr>
-          <w:p>
-            <w:pPr>
-              <w:spacing w:after="60" w:before="60"/>
-              <w:jc w:val="left"/>
+              <w:spacing w:before="60" w:after="60"/>
             </w:pPr>
             <w:r>
               <w:rPr>
                 <w:rFonts w:ascii="Malgun Gothic" w:hAnsi="Malgun Gothic" w:eastAsia="Malgun Gothic"/>
                 <w:b w:val="0"/>
-                <w:color w:val="6A7D90"/>
-                <w:sz w:val="19"/>
-              </w:rPr>
-              <w:t>[기관·대상·기간 입력]</w:t>
-            </w:r>
-          </w:p>
-        </w:tc>
-      </w:tr>
-      <w:tr>
-        <w:tc>
-          <w:tcPr>
-            <w:tcW w:type="dxa" w:w="2600"/>
-            <w:shd w:fill="F2F4F7"/>
-            <w:vAlign w:val="center"/>
-          </w:tcPr>
-          <w:p>
-            <w:pPr>
-              <w:spacing w:after="60" w:before="60"/>
-              <w:jc w:val="left"/>
-            </w:pPr>
-            <w:r>
-              <w:rPr>
-                <w:rFonts w:ascii="Malgun Gothic" w:hAnsi="Malgun Gothic" w:eastAsia="Malgun Gothic"/>
-                <w:b/>
-                <w:color w:val="29465F"/>
-                <w:sz w:val="19"/>
-              </w:rPr>
-              <w:t>기준일</w:t>
-            </w:r>
-          </w:p>
-        </w:tc>
-        <w:tc>
-          <w:tcPr>
-            <w:tcW w:type="dxa" w:w="6760"/>
-            <w:vAlign w:val="center"/>
-          </w:tcPr>
-          <w:p>
-            <w:pPr>
-              <w:spacing w:after="60" w:before="60"/>
-              <w:jc w:val="left"/>
-            </w:pPr>
-            <w:r>
-              <w:rPr>
-                <w:rFonts w:ascii="Malgun Gothic" w:hAnsi="Malgun Gothic" w:eastAsia="Malgun Gothic"/>
-                <w:b w:val="0"/>
-                <w:color w:val="6A7D90"/>
-                <w:sz w:val="19"/>
-              </w:rPr>
-              <w:t>[YYYY.MM.DD]</w:t>
-            </w:r>
-          </w:p>
-        </w:tc>
-      </w:tr>
-      <w:tr>
-        <w:tc>
-          <w:tcPr>
-            <w:tcW w:type="dxa" w:w="2600"/>
-            <w:shd w:fill="F2F4F7"/>
-            <w:vAlign w:val="center"/>
-          </w:tcPr>
-          <w:p>
-            <w:pPr>
-              <w:spacing w:after="60" w:before="60"/>
-              <w:jc w:val="left"/>
-            </w:pPr>
-            <w:r>
-              <w:rPr>
-                <w:rFonts w:ascii="Malgun Gothic" w:hAnsi="Malgun Gothic" w:eastAsia="Malgun Gothic"/>
-                <w:b/>
-                <w:color w:val="29465F"/>
-                <w:sz w:val="19"/>
-              </w:rPr>
-              <w:t>활용 문서</w:t>
-            </w:r>
-          </w:p>
-        </w:tc>
-        <w:tc>
-          <w:tcPr>
-            <w:tcW w:type="dxa" w:w="6760"/>
-            <w:vAlign w:val="center"/>
-          </w:tcPr>
-          <w:p>
-            <w:pPr>
-              <w:spacing w:after="60" w:before="60"/>
-              <w:jc w:val="left"/>
-            </w:pPr>
-            <w:r>
-              <w:rPr>
-                <w:rFonts w:ascii="Malgun Gothic" w:hAnsi="Malgun Gothic" w:eastAsia="Malgun Gothic"/>
-                <w:b w:val="0"/>
-                <w:color w:val="6A7D90"/>
-                <w:sz w:val="19"/>
-              </w:rPr>
-              <w:t>[안내문 / FAQ / 운영 참고안 등]</w:t>
-            </w:r>
-          </w:p>
-        </w:tc>
-      </w:tr>
-    </w:tbl>
-    <w:p>
-      <w:pPr>
-        <w:pStyle w:val="Heading1"/>
-      </w:pPr>
-      <w:r>
-        <w:t>출처 목록</w:t>
-      </w:r>
-    </w:p>
-    <w:tbl>
-      <w:tblPr>
-        <w:tblW w:type="auto" w:w="0"/>
-        <w:jc w:val="left"/>
-        <w:tblLayout w:type="fixed"/>
-        <w:tblLook w:firstColumn="1" w:firstRow="1" w:lastColumn="0" w:lastRow="0" w:noHBand="0" w:noVBand="1" w:val="04A0"/>
-      </w:tblPr>
-      <w:tblGrid>
-        <w:gridCol w:w="700"/>
-        <w:gridCol w:w="4100"/>
-        <w:gridCol w:w="1700"/>
-        <w:gridCol w:w="2860"/>
-      </w:tblGrid>
-      <w:tr>
-        <w:tc>
-          <w:tcPr>
-            <w:tcW w:type="dxa" w:w="700"/>
-            <w:shd w:fill="DCEAF6"/>
-            <w:vAlign w:val="center"/>
-          </w:tcPr>
-          <w:p>
-            <w:pPr>
-              <w:spacing w:after="60" w:before="60"/>
-              <w:jc w:val="left"/>
-            </w:pPr>
-            <w:r>
-              <w:rPr>
-                <w:rFonts w:ascii="Malgun Gothic" w:hAnsi="Malgun Gothic" w:eastAsia="Malgun Gothic"/>
-                <w:b/>
-                <w:color w:val="244A70"/>
-                <w:sz w:val="19"/>
-              </w:rPr>
-              <w:t>번호</w:t>
-            </w:r>
-          </w:p>
-        </w:tc>
-        <w:tc>
-          <w:tcPr>
-            <w:tcW w:type="dxa" w:w="4100"/>
-            <w:shd w:fill="DCEAF6"/>
-            <w:vAlign w:val="center"/>
-          </w:tcPr>
-          <w:p>
-            <w:pPr>
-              <w:spacing w:after="60" w:before="60"/>
-              <w:jc w:val="left"/>
-            </w:pPr>
-            <w:r>
-              <w:rPr>
-                <w:rFonts w:ascii="Malgun Gothic" w:hAnsi="Malgun Gothic" w:eastAsia="Malgun Gothic"/>
-                <w:b/>
-                <w:color w:val="244A70"/>
-                <w:sz w:val="19"/>
-              </w:rPr>
-              <w:t>출처명·URL</w:t>
-            </w:r>
-          </w:p>
-        </w:tc>
-        <w:tc>
-          <w:tcPr>
-            <w:tcW w:type="dxa" w:w="1700"/>
-            <w:shd w:fill="DCEAF6"/>
-            <w:vAlign w:val="center"/>
-          </w:tcPr>
-          <w:p>
-            <w:pPr>
-              <w:spacing w:after="60" w:before="60"/>
-              <w:jc w:val="left"/>
-            </w:pPr>
-            <w:r>
-              <w:rPr>
-                <w:rFonts w:ascii="Malgun Gothic" w:hAnsi="Malgun Gothic" w:eastAsia="Malgun Gothic"/>
-                <w:b/>
-                <w:color w:val="244A70"/>
-                <w:sz w:val="19"/>
-              </w:rPr>
-              <w:t>게시·수정일</w:t>
-            </w:r>
-          </w:p>
-        </w:tc>
-        <w:tc>
-          <w:tcPr>
-            <w:tcW w:type="dxa" w:w="2860"/>
-            <w:shd w:fill="DCEAF6"/>
-            <w:vAlign w:val="center"/>
-          </w:tcPr>
-          <w:p>
-            <w:pPr>
-              <w:spacing w:after="60" w:before="60"/>
-              <w:jc w:val="left"/>
-            </w:pPr>
-            <w:r>
-              <w:rPr>
-                <w:rFonts w:ascii="Malgun Gothic" w:hAnsi="Malgun Gothic" w:eastAsia="Malgun Gothic"/>
-                <w:b/>
-                <w:color w:val="244A70"/>
-                <w:sz w:val="19"/>
-              </w:rPr>
-              <w:t>활용 내용</w:t>
-            </w:r>
-          </w:p>
-        </w:tc>
-      </w:tr>
-      <w:tr>
-        <w:tc>
-          <w:tcPr>
-            <w:tcW w:type="dxa" w:w="700"/>
-            <w:vAlign w:val="center"/>
-          </w:tcPr>
-          <w:p>
-            <w:pPr>
-              <w:spacing w:after="60" w:before="60"/>
-              <w:jc w:val="left"/>
-            </w:pPr>
-            <w:r>
-              <w:rPr>
-                <w:rFonts w:ascii="Malgun Gothic" w:hAnsi="Malgun Gothic" w:eastAsia="Malgun Gothic"/>
-                <w:b w:val="0"/>
-                <w:color w:val="6A7D90"/>
                 <w:sz w:val="19"/>
               </w:rPr>
               <w:t>1</w:t>
@@ -413,64 +273,58 @@
         </w:tc>
         <w:tc>
           <w:tcPr>
-            <w:tcW w:type="dxa" w:w="4100"/>
+            <w:tcW w:type="dxa" w:w="2880"/>
             <w:vAlign w:val="center"/>
           </w:tcPr>
           <w:p>
             <w:pPr>
-              <w:spacing w:after="60" w:before="60"/>
-              <w:jc w:val="left"/>
+              <w:spacing w:before="60" w:after="60"/>
             </w:pPr>
             <w:r>
               <w:rPr>
                 <w:rFonts w:ascii="Malgun Gothic" w:hAnsi="Malgun Gothic" w:eastAsia="Malgun Gothic"/>
                 <w:b w:val="0"/>
-                <w:color w:val="6A7D90"/>
                 <w:sz w:val="19"/>
               </w:rPr>
-              <w:t>[출처명 / URL 입력]</w:t>
+              <w:t>○○대학교 ○○ 안내</w:t>
             </w:r>
           </w:p>
         </w:tc>
         <w:tc>
           <w:tcPr>
-            <w:tcW w:type="dxa" w:w="1700"/>
+            <w:tcW w:type="dxa" w:w="3816"/>
             <w:vAlign w:val="center"/>
           </w:tcPr>
           <w:p>
             <w:pPr>
-              <w:spacing w:after="60" w:before="60"/>
-              <w:jc w:val="left"/>
+              <w:spacing w:before="60" w:after="60"/>
             </w:pPr>
             <w:r>
               <w:rPr>
                 <w:rFonts w:ascii="Malgun Gothic" w:hAnsi="Malgun Gothic" w:eastAsia="Malgun Gothic"/>
                 <w:b w:val="0"/>
-                <w:color w:val="6A7D90"/>
                 <w:sz w:val="19"/>
               </w:rPr>
-              <w:t>[날짜]</w:t>
+              <w:t>○○</w:t>
             </w:r>
           </w:p>
         </w:tc>
         <w:tc>
           <w:tcPr>
-            <w:tcW w:type="dxa" w:w="2860"/>
+            <w:tcW w:type="dxa" w:w="1728"/>
             <w:vAlign w:val="center"/>
           </w:tcPr>
           <w:p>
             <w:pPr>
-              <w:spacing w:after="60" w:before="60"/>
-              <w:jc w:val="left"/>
+              <w:spacing w:before="60" w:after="60"/>
             </w:pPr>
             <w:r>
               <w:rPr>
                 <w:rFonts w:ascii="Malgun Gothic" w:hAnsi="Malgun Gothic" w:eastAsia="Malgun Gothic"/>
                 <w:b w:val="0"/>
-                <w:color w:val="6A7D90"/>
                 <w:sz w:val="19"/>
               </w:rPr>
-              <w:t>[활용한 사실·수치]</w:t>
+              <w:t>20○○.○.○.</w:t>
             </w:r>
           </w:p>
         </w:tc>
@@ -478,19 +332,17 @@
       <w:tr>
         <w:tc>
           <w:tcPr>
-            <w:tcW w:type="dxa" w:w="700"/>
+            <w:tcW w:type="dxa" w:w="792"/>
             <w:vAlign w:val="center"/>
           </w:tcPr>
           <w:p>
             <w:pPr>
-              <w:spacing w:after="60" w:before="60"/>
-              <w:jc w:val="left"/>
+              <w:spacing w:before="60" w:after="60"/>
             </w:pPr>
             <w:r>
               <w:rPr>
                 <w:rFonts w:ascii="Malgun Gothic" w:hAnsi="Malgun Gothic" w:eastAsia="Malgun Gothic"/>
                 <w:b w:val="0"/>
-                <w:color w:val="6A7D90"/>
                 <w:sz w:val="19"/>
               </w:rPr>
               <w:t>2</w:t>
@@ -499,64 +351,58 @@
         </w:tc>
         <w:tc>
           <w:tcPr>
-            <w:tcW w:type="dxa" w:w="4100"/>
+            <w:tcW w:type="dxa" w:w="2880"/>
             <w:vAlign w:val="center"/>
           </w:tcPr>
           <w:p>
             <w:pPr>
-              <w:spacing w:after="60" w:before="60"/>
-              <w:jc w:val="left"/>
+              <w:spacing w:before="60" w:after="60"/>
             </w:pPr>
             <w:r>
               <w:rPr>
                 <w:rFonts w:ascii="Malgun Gothic" w:hAnsi="Malgun Gothic" w:eastAsia="Malgun Gothic"/>
                 <w:b w:val="0"/>
-                <w:color w:val="6A7D90"/>
                 <w:sz w:val="19"/>
               </w:rPr>
-              <w:t>[출처명 / URL 입력]</w:t>
+              <w:t>○○기관 ○○ 규정</w:t>
             </w:r>
           </w:p>
         </w:tc>
         <w:tc>
           <w:tcPr>
-            <w:tcW w:type="dxa" w:w="1700"/>
+            <w:tcW w:type="dxa" w:w="3816"/>
             <w:vAlign w:val="center"/>
           </w:tcPr>
           <w:p>
             <w:pPr>
-              <w:spacing w:after="60" w:before="60"/>
-              <w:jc w:val="left"/>
+              <w:spacing w:before="60" w:after="60"/>
             </w:pPr>
             <w:r>
               <w:rPr>
                 <w:rFonts w:ascii="Malgun Gothic" w:hAnsi="Malgun Gothic" w:eastAsia="Malgun Gothic"/>
                 <w:b w:val="0"/>
-                <w:color w:val="6A7D90"/>
                 <w:sz w:val="19"/>
               </w:rPr>
-              <w:t>[날짜]</w:t>
+              <w:t>○○</w:t>
             </w:r>
           </w:p>
         </w:tc>
         <w:tc>
           <w:tcPr>
-            <w:tcW w:type="dxa" w:w="2860"/>
+            <w:tcW w:type="dxa" w:w="1728"/>
             <w:vAlign w:val="center"/>
           </w:tcPr>
           <w:p>
             <w:pPr>
-              <w:spacing w:after="60" w:before="60"/>
-              <w:jc w:val="left"/>
+              <w:spacing w:before="60" w:after="60"/>
             </w:pPr>
             <w:r>
               <w:rPr>
                 <w:rFonts w:ascii="Malgun Gothic" w:hAnsi="Malgun Gothic" w:eastAsia="Malgun Gothic"/>
                 <w:b w:val="0"/>
-                <w:color w:val="6A7D90"/>
                 <w:sz w:val="19"/>
               </w:rPr>
-              <w:t>[활용한 사실·수치]</w:t>
+              <w:t>20○○.○.○.</w:t>
             </w:r>
           </w:p>
         </w:tc>
@@ -564,19 +410,17 @@
       <w:tr>
         <w:tc>
           <w:tcPr>
-            <w:tcW w:type="dxa" w:w="700"/>
+            <w:tcW w:type="dxa" w:w="792"/>
             <w:vAlign w:val="center"/>
           </w:tcPr>
           <w:p>
             <w:pPr>
-              <w:spacing w:after="60" w:before="60"/>
-              <w:jc w:val="left"/>
+              <w:spacing w:before="60" w:after="60"/>
             </w:pPr>
             <w:r>
               <w:rPr>
                 <w:rFonts w:ascii="Malgun Gothic" w:hAnsi="Malgun Gothic" w:eastAsia="Malgun Gothic"/>
                 <w:b w:val="0"/>
-                <w:color w:val="6A7D90"/>
                 <w:sz w:val="19"/>
               </w:rPr>
               <w:t>3</w:t>
@@ -585,64 +429,58 @@
         </w:tc>
         <w:tc>
           <w:tcPr>
-            <w:tcW w:type="dxa" w:w="4100"/>
+            <w:tcW w:type="dxa" w:w="2880"/>
             <w:vAlign w:val="center"/>
           </w:tcPr>
           <w:p>
             <w:pPr>
-              <w:spacing w:after="60" w:before="60"/>
-              <w:jc w:val="left"/>
+              <w:spacing w:before="60" w:after="60"/>
             </w:pPr>
             <w:r>
               <w:rPr>
                 <w:rFonts w:ascii="Malgun Gothic" w:hAnsi="Malgun Gothic" w:eastAsia="Malgun Gothic"/>
                 <w:b w:val="0"/>
-                <w:color w:val="6A7D90"/>
                 <w:sz w:val="19"/>
               </w:rPr>
-              <w:t>[출처명 / URL 입력]</w:t>
+              <w:t>○○기관 ○○ 공고</w:t>
             </w:r>
           </w:p>
         </w:tc>
         <w:tc>
           <w:tcPr>
-            <w:tcW w:type="dxa" w:w="1700"/>
+            <w:tcW w:type="dxa" w:w="3816"/>
             <w:vAlign w:val="center"/>
           </w:tcPr>
           <w:p>
             <w:pPr>
-              <w:spacing w:after="60" w:before="60"/>
-              <w:jc w:val="left"/>
+              <w:spacing w:before="60" w:after="60"/>
             </w:pPr>
             <w:r>
               <w:rPr>
                 <w:rFonts w:ascii="Malgun Gothic" w:hAnsi="Malgun Gothic" w:eastAsia="Malgun Gothic"/>
                 <w:b w:val="0"/>
-                <w:color w:val="6A7D90"/>
                 <w:sz w:val="19"/>
               </w:rPr>
-              <w:t>[날짜]</w:t>
+              <w:t>○○</w:t>
             </w:r>
           </w:p>
         </w:tc>
         <w:tc>
           <w:tcPr>
-            <w:tcW w:type="dxa" w:w="2860"/>
+            <w:tcW w:type="dxa" w:w="1728"/>
             <w:vAlign w:val="center"/>
           </w:tcPr>
           <w:p>
             <w:pPr>
-              <w:spacing w:after="60" w:before="60"/>
-              <w:jc w:val="left"/>
+              <w:spacing w:before="60" w:after="60"/>
             </w:pPr>
             <w:r>
               <w:rPr>
                 <w:rFonts w:ascii="Malgun Gothic" w:hAnsi="Malgun Gothic" w:eastAsia="Malgun Gothic"/>
                 <w:b w:val="0"/>
-                <w:color w:val="6A7D90"/>
                 <w:sz w:val="19"/>
               </w:rPr>
-              <w:t>[활용한 사실·수치]</w:t>
+              <w:t>20○○.○.○.</w:t>
             </w:r>
           </w:p>
         </w:tc>
@@ -650,620 +488,63 @@
     </w:tbl>
     <w:p>
       <w:pPr>
-        <w:pStyle w:val="Heading1"/>
+        <w:spacing w:after="60"/>
+        <w:ind w:left="0"/>
       </w:pPr>
       <w:r>
-        <w:t>2. 핵심 비교</w:t>
+        <w:rPr>
+          <w:rFonts w:ascii="Malgun Gothic" w:hAnsi="Malgun Gothic" w:eastAsia="Malgun Gothic"/>
+          <w:b/>
+          <w:sz w:val="21"/>
+        </w:rPr>
+        <w:t>3. 검토 의견</w:t>
       </w:r>
     </w:p>
-    <w:tbl>
-      <w:tblPr>
-        <w:tblW w:type="auto" w:w="0"/>
-        <w:jc w:val="left"/>
-        <w:tblLayout w:type="fixed"/>
-        <w:tblLook w:firstColumn="1" w:firstRow="1" w:lastColumn="0" w:lastRow="0" w:noHBand="0" w:noVBand="1" w:val="04A0"/>
-      </w:tblPr>
-      <w:tblGrid>
-        <w:gridCol w:w="1800"/>
-        <w:gridCol w:w="2500"/>
-        <w:gridCol w:w="2500"/>
-        <w:gridCol w:w="2560"/>
-      </w:tblGrid>
-      <w:tr>
-        <w:tc>
-          <w:tcPr>
-            <w:tcW w:type="dxa" w:w="1800"/>
-            <w:shd w:fill="DCEAF6"/>
-            <w:vAlign w:val="center"/>
-          </w:tcPr>
-          <w:p>
-            <w:pPr>
-              <w:spacing w:after="60" w:before="60"/>
-              <w:jc w:val="left"/>
-            </w:pPr>
-            <w:r>
-              <w:rPr>
-                <w:rFonts w:ascii="Malgun Gothic" w:hAnsi="Malgun Gothic" w:eastAsia="Malgun Gothic"/>
-                <w:b/>
-                <w:color w:val="244A70"/>
-                <w:sz w:val="19"/>
-              </w:rPr>
-              <w:t>비교 항목</w:t>
-            </w:r>
-          </w:p>
-        </w:tc>
-        <w:tc>
-          <w:tcPr>
-            <w:tcW w:type="dxa" w:w="2500"/>
-            <w:shd w:fill="DCEAF6"/>
-            <w:vAlign w:val="center"/>
-          </w:tcPr>
-          <w:p>
-            <w:pPr>
-              <w:spacing w:after="60" w:before="60"/>
-              <w:jc w:val="left"/>
-            </w:pPr>
-            <w:r>
-              <w:rPr>
-                <w:rFonts w:ascii="Malgun Gothic" w:hAnsi="Malgun Gothic" w:eastAsia="Malgun Gothic"/>
-                <w:b/>
-                <w:color w:val="244A70"/>
-                <w:sz w:val="19"/>
-              </w:rPr>
-              <w:t>기관·자료 A</w:t>
-            </w:r>
-          </w:p>
-        </w:tc>
-        <w:tc>
-          <w:tcPr>
-            <w:tcW w:type="dxa" w:w="2500"/>
-            <w:shd w:fill="DCEAF6"/>
-            <w:vAlign w:val="center"/>
-          </w:tcPr>
-          <w:p>
-            <w:pPr>
-              <w:spacing w:after="60" w:before="60"/>
-              <w:jc w:val="left"/>
-            </w:pPr>
-            <w:r>
-              <w:rPr>
-                <w:rFonts w:ascii="Malgun Gothic" w:hAnsi="Malgun Gothic" w:eastAsia="Malgun Gothic"/>
-                <w:b/>
-                <w:color w:val="244A70"/>
-                <w:sz w:val="19"/>
-              </w:rPr>
-              <w:t>기관·자료 B</w:t>
-            </w:r>
-          </w:p>
-        </w:tc>
-        <w:tc>
-          <w:tcPr>
-            <w:tcW w:type="dxa" w:w="2560"/>
-            <w:shd w:fill="DCEAF6"/>
-            <w:vAlign w:val="center"/>
-          </w:tcPr>
-          <w:p>
-            <w:pPr>
-              <w:spacing w:after="60" w:before="60"/>
-              <w:jc w:val="left"/>
-            </w:pPr>
-            <w:r>
-              <w:rPr>
-                <w:rFonts w:ascii="Malgun Gothic" w:hAnsi="Malgun Gothic" w:eastAsia="Malgun Gothic"/>
-                <w:b/>
-                <w:color w:val="244A70"/>
-                <w:sz w:val="19"/>
-              </w:rPr>
-              <w:t>확인할 차이</w:t>
-            </w:r>
-          </w:p>
-        </w:tc>
-      </w:tr>
-      <w:tr>
-        <w:tc>
-          <w:tcPr>
-            <w:tcW w:type="dxa" w:w="1800"/>
-            <w:vAlign w:val="center"/>
-          </w:tcPr>
-          <w:p>
-            <w:pPr>
-              <w:spacing w:after="60" w:before="60"/>
-              <w:jc w:val="left"/>
-            </w:pPr>
-            <w:r>
-              <w:rPr>
-                <w:rFonts w:ascii="Malgun Gothic" w:hAnsi="Malgun Gothic" w:eastAsia="Malgun Gothic"/>
-                <w:b w:val="0"/>
-                <w:color w:val="6A7D90"/>
-                <w:sz w:val="19"/>
-              </w:rPr>
-              <w:t>대상·자격</w:t>
-            </w:r>
-          </w:p>
-        </w:tc>
-        <w:tc>
-          <w:tcPr>
-            <w:tcW w:type="dxa" w:w="2500"/>
-            <w:vAlign w:val="center"/>
-          </w:tcPr>
-          <w:p>
-            <w:pPr>
-              <w:spacing w:after="60" w:before="60"/>
-              <w:jc w:val="left"/>
-            </w:pPr>
-            <w:r>
-              <w:rPr>
-                <w:rFonts w:ascii="Malgun Gothic" w:hAnsi="Malgun Gothic" w:eastAsia="Malgun Gothic"/>
-                <w:b w:val="0"/>
-                <w:color w:val="6A7D90"/>
-                <w:sz w:val="19"/>
-              </w:rPr>
-              <w:t>[입력]</w:t>
-            </w:r>
-          </w:p>
-        </w:tc>
-        <w:tc>
-          <w:tcPr>
-            <w:tcW w:type="dxa" w:w="2500"/>
-            <w:vAlign w:val="center"/>
-          </w:tcPr>
-          <w:p>
-            <w:pPr>
-              <w:spacing w:after="60" w:before="60"/>
-              <w:jc w:val="left"/>
-            </w:pPr>
-            <w:r>
-              <w:rPr>
-                <w:rFonts w:ascii="Malgun Gothic" w:hAnsi="Malgun Gothic" w:eastAsia="Malgun Gothic"/>
-                <w:b w:val="0"/>
-                <w:color w:val="6A7D90"/>
-                <w:sz w:val="19"/>
-              </w:rPr>
-              <w:t>[입력]</w:t>
-            </w:r>
-          </w:p>
-        </w:tc>
-        <w:tc>
-          <w:tcPr>
-            <w:tcW w:type="dxa" w:w="2560"/>
-            <w:vAlign w:val="center"/>
-          </w:tcPr>
-          <w:p>
-            <w:pPr>
-              <w:spacing w:after="60" w:before="60"/>
-              <w:jc w:val="left"/>
-            </w:pPr>
-            <w:r>
-              <w:rPr>
-                <w:rFonts w:ascii="Malgun Gothic" w:hAnsi="Malgun Gothic" w:eastAsia="Malgun Gothic"/>
-                <w:b w:val="0"/>
-                <w:color w:val="6A7D90"/>
-                <w:sz w:val="19"/>
-              </w:rPr>
-              <w:t>[입력]</w:t>
-            </w:r>
-          </w:p>
-        </w:tc>
-      </w:tr>
-      <w:tr>
-        <w:tc>
-          <w:tcPr>
-            <w:tcW w:type="dxa" w:w="1800"/>
-            <w:vAlign w:val="center"/>
-          </w:tcPr>
-          <w:p>
-            <w:pPr>
-              <w:spacing w:after="60" w:before="60"/>
-              <w:jc w:val="left"/>
-            </w:pPr>
-            <w:r>
-              <w:rPr>
-                <w:rFonts w:ascii="Malgun Gothic" w:hAnsi="Malgun Gothic" w:eastAsia="Malgun Gothic"/>
-                <w:b w:val="0"/>
-                <w:color w:val="6A7D90"/>
-                <w:sz w:val="19"/>
-              </w:rPr>
-              <w:t>일정·기간</w:t>
-            </w:r>
-          </w:p>
-        </w:tc>
-        <w:tc>
-          <w:tcPr>
-            <w:tcW w:type="dxa" w:w="2500"/>
-            <w:vAlign w:val="center"/>
-          </w:tcPr>
-          <w:p>
-            <w:pPr>
-              <w:spacing w:after="60" w:before="60"/>
-              <w:jc w:val="left"/>
-            </w:pPr>
-            <w:r>
-              <w:rPr>
-                <w:rFonts w:ascii="Malgun Gothic" w:hAnsi="Malgun Gothic" w:eastAsia="Malgun Gothic"/>
-                <w:b w:val="0"/>
-                <w:color w:val="6A7D90"/>
-                <w:sz w:val="19"/>
-              </w:rPr>
-              <w:t>[입력]</w:t>
-            </w:r>
-          </w:p>
-        </w:tc>
-        <w:tc>
-          <w:tcPr>
-            <w:tcW w:type="dxa" w:w="2500"/>
-            <w:vAlign w:val="center"/>
-          </w:tcPr>
-          <w:p>
-            <w:pPr>
-              <w:spacing w:after="60" w:before="60"/>
-              <w:jc w:val="left"/>
-            </w:pPr>
-            <w:r>
-              <w:rPr>
-                <w:rFonts w:ascii="Malgun Gothic" w:hAnsi="Malgun Gothic" w:eastAsia="Malgun Gothic"/>
-                <w:b w:val="0"/>
-                <w:color w:val="6A7D90"/>
-                <w:sz w:val="19"/>
-              </w:rPr>
-              <w:t>[입력]</w:t>
-            </w:r>
-          </w:p>
-        </w:tc>
-        <w:tc>
-          <w:tcPr>
-            <w:tcW w:type="dxa" w:w="2560"/>
-            <w:vAlign w:val="center"/>
-          </w:tcPr>
-          <w:p>
-            <w:pPr>
-              <w:spacing w:after="60" w:before="60"/>
-              <w:jc w:val="left"/>
-            </w:pPr>
-            <w:r>
-              <w:rPr>
-                <w:rFonts w:ascii="Malgun Gothic" w:hAnsi="Malgun Gothic" w:eastAsia="Malgun Gothic"/>
-                <w:b w:val="0"/>
-                <w:color w:val="6A7D90"/>
-                <w:sz w:val="19"/>
-              </w:rPr>
-              <w:t>[입력]</w:t>
-            </w:r>
-          </w:p>
-        </w:tc>
-      </w:tr>
-      <w:tr>
-        <w:tc>
-          <w:tcPr>
-            <w:tcW w:type="dxa" w:w="1800"/>
-            <w:vAlign w:val="center"/>
-          </w:tcPr>
-          <w:p>
-            <w:pPr>
-              <w:spacing w:after="60" w:before="60"/>
-              <w:jc w:val="left"/>
-            </w:pPr>
-            <w:r>
-              <w:rPr>
-                <w:rFonts w:ascii="Malgun Gothic" w:hAnsi="Malgun Gothic" w:eastAsia="Malgun Gothic"/>
-                <w:b w:val="0"/>
-                <w:color w:val="6A7D90"/>
-                <w:sz w:val="19"/>
-              </w:rPr>
-              <w:t>절차·제출물</w:t>
-            </w:r>
-          </w:p>
-        </w:tc>
-        <w:tc>
-          <w:tcPr>
-            <w:tcW w:type="dxa" w:w="2500"/>
-            <w:vAlign w:val="center"/>
-          </w:tcPr>
-          <w:p>
-            <w:pPr>
-              <w:spacing w:after="60" w:before="60"/>
-              <w:jc w:val="left"/>
-            </w:pPr>
-            <w:r>
-              <w:rPr>
-                <w:rFonts w:ascii="Malgun Gothic" w:hAnsi="Malgun Gothic" w:eastAsia="Malgun Gothic"/>
-                <w:b w:val="0"/>
-                <w:color w:val="6A7D90"/>
-                <w:sz w:val="19"/>
-              </w:rPr>
-              <w:t>[입력]</w:t>
-            </w:r>
-          </w:p>
-        </w:tc>
-        <w:tc>
-          <w:tcPr>
-            <w:tcW w:type="dxa" w:w="2500"/>
-            <w:vAlign w:val="center"/>
-          </w:tcPr>
-          <w:p>
-            <w:pPr>
-              <w:spacing w:after="60" w:before="60"/>
-              <w:jc w:val="left"/>
-            </w:pPr>
-            <w:r>
-              <w:rPr>
-                <w:rFonts w:ascii="Malgun Gothic" w:hAnsi="Malgun Gothic" w:eastAsia="Malgun Gothic"/>
-                <w:b w:val="0"/>
-                <w:color w:val="6A7D90"/>
-                <w:sz w:val="19"/>
-              </w:rPr>
-              <w:t>[입력]</w:t>
-            </w:r>
-          </w:p>
-        </w:tc>
-        <w:tc>
-          <w:tcPr>
-            <w:tcW w:type="dxa" w:w="2560"/>
-            <w:vAlign w:val="center"/>
-          </w:tcPr>
-          <w:p>
-            <w:pPr>
-              <w:spacing w:after="60" w:before="60"/>
-              <w:jc w:val="left"/>
-            </w:pPr>
-            <w:r>
-              <w:rPr>
-                <w:rFonts w:ascii="Malgun Gothic" w:hAnsi="Malgun Gothic" w:eastAsia="Malgun Gothic"/>
-                <w:b w:val="0"/>
-                <w:color w:val="6A7D90"/>
-                <w:sz w:val="19"/>
-              </w:rPr>
-              <w:t>[입력]</w:t>
-            </w:r>
-          </w:p>
-        </w:tc>
-      </w:tr>
-      <w:tr>
-        <w:tc>
-          <w:tcPr>
-            <w:tcW w:type="dxa" w:w="1800"/>
-            <w:vAlign w:val="center"/>
-          </w:tcPr>
-          <w:p>
-            <w:pPr>
-              <w:spacing w:after="60" w:before="60"/>
-              <w:jc w:val="left"/>
-            </w:pPr>
-            <w:r>
-              <w:rPr>
-                <w:rFonts w:ascii="Malgun Gothic" w:hAnsi="Malgun Gothic" w:eastAsia="Malgun Gothic"/>
-                <w:b w:val="0"/>
-                <w:color w:val="6A7D90"/>
-                <w:sz w:val="19"/>
-              </w:rPr>
-              <w:t>문의처·공식 확인 경로</w:t>
-            </w:r>
-          </w:p>
-        </w:tc>
-        <w:tc>
-          <w:tcPr>
-            <w:tcW w:type="dxa" w:w="2500"/>
-            <w:vAlign w:val="center"/>
-          </w:tcPr>
-          <w:p>
-            <w:pPr>
-              <w:spacing w:after="60" w:before="60"/>
-              <w:jc w:val="left"/>
-            </w:pPr>
-            <w:r>
-              <w:rPr>
-                <w:rFonts w:ascii="Malgun Gothic" w:hAnsi="Malgun Gothic" w:eastAsia="Malgun Gothic"/>
-                <w:b w:val="0"/>
-                <w:color w:val="6A7D90"/>
-                <w:sz w:val="19"/>
-              </w:rPr>
-              <w:t>[입력]</w:t>
-            </w:r>
-          </w:p>
-        </w:tc>
-        <w:tc>
-          <w:tcPr>
-            <w:tcW w:type="dxa" w:w="2500"/>
-            <w:vAlign w:val="center"/>
-          </w:tcPr>
-          <w:p>
-            <w:pPr>
-              <w:spacing w:after="60" w:before="60"/>
-              <w:jc w:val="left"/>
-            </w:pPr>
-            <w:r>
-              <w:rPr>
-                <w:rFonts w:ascii="Malgun Gothic" w:hAnsi="Malgun Gothic" w:eastAsia="Malgun Gothic"/>
-                <w:b w:val="0"/>
-                <w:color w:val="6A7D90"/>
-                <w:sz w:val="19"/>
-              </w:rPr>
-              <w:t>[입력]</w:t>
-            </w:r>
-          </w:p>
-        </w:tc>
-        <w:tc>
-          <w:tcPr>
-            <w:tcW w:type="dxa" w:w="2560"/>
-            <w:vAlign w:val="center"/>
-          </w:tcPr>
-          <w:p>
-            <w:pPr>
-              <w:spacing w:after="60" w:before="60"/>
-              <w:jc w:val="left"/>
-            </w:pPr>
-            <w:r>
-              <w:rPr>
-                <w:rFonts w:ascii="Malgun Gothic" w:hAnsi="Malgun Gothic" w:eastAsia="Malgun Gothic"/>
-                <w:b w:val="0"/>
-                <w:color w:val="6A7D90"/>
-                <w:sz w:val="19"/>
-              </w:rPr>
-              <w:t>[입력]</w:t>
-            </w:r>
-          </w:p>
-        </w:tc>
-      </w:tr>
-    </w:tbl>
     <w:p>
       <w:pPr>
-        <w:pStyle w:val="Heading1"/>
+        <w:spacing w:after="60"/>
+        <w:ind w:left="259"/>
       </w:pPr>
       <w:r>
-        <w:t>3. 활용 시사점과 확인 사항</w:t>
+        <w:rPr>
+          <w:rFonts w:ascii="Malgun Gothic" w:hAnsi="Malgun Gothic" w:eastAsia="Malgun Gothic"/>
+          <w:b w:val="0"/>
+          <w:sz w:val="21"/>
+        </w:rPr>
+        <w:t xml:space="preserve">  가. 공통 확인 사항: ○○</w:t>
       </w:r>
     </w:p>
-    <w:tbl>
-      <w:tblPr>
-        <w:tblW w:type="auto" w:w="0"/>
-        <w:jc w:val="left"/>
-        <w:tblLayout w:type="fixed"/>
-        <w:tblLook w:firstColumn="1" w:firstRow="1" w:lastColumn="0" w:lastRow="0" w:noHBand="0" w:noVBand="1" w:val="04A0"/>
-      </w:tblPr>
-      <w:tblGrid>
-        <w:gridCol w:w="2600"/>
-        <w:gridCol w:w="6760"/>
-      </w:tblGrid>
-      <w:tr>
-        <w:tc>
-          <w:tcPr>
-            <w:tcW w:type="dxa" w:w="2600"/>
-            <w:shd w:fill="F2F4F7"/>
-            <w:vAlign w:val="center"/>
-          </w:tcPr>
-          <w:p>
-            <w:pPr>
-              <w:spacing w:after="60" w:before="60"/>
-              <w:jc w:val="left"/>
-            </w:pPr>
-            <w:r>
-              <w:rPr>
-                <w:rFonts w:ascii="Malgun Gothic" w:hAnsi="Malgun Gothic" w:eastAsia="Malgun Gothic"/>
-                <w:b/>
-                <w:color w:val="29465F"/>
-                <w:sz w:val="19"/>
-              </w:rPr>
-              <w:t>문서화에 사용할 공개 사실</w:t>
-            </w:r>
-          </w:p>
-        </w:tc>
-        <w:tc>
-          <w:tcPr>
-            <w:tcW w:type="dxa" w:w="6760"/>
-            <w:vAlign w:val="center"/>
-          </w:tcPr>
-          <w:p>
-            <w:pPr>
-              <w:spacing w:after="60" w:before="60"/>
-              <w:jc w:val="left"/>
-            </w:pPr>
-            <w:r>
-              <w:rPr>
-                <w:rFonts w:ascii="Malgun Gothic" w:hAnsi="Malgun Gothic" w:eastAsia="Malgun Gothic"/>
-                <w:b w:val="0"/>
-                <w:color w:val="6A7D90"/>
-                <w:sz w:val="19"/>
-              </w:rPr>
-              <w:t>[출처와 함께 입력]</w:t>
-            </w:r>
-          </w:p>
-        </w:tc>
-      </w:tr>
-      <w:tr>
-        <w:tc>
-          <w:tcPr>
-            <w:tcW w:type="dxa" w:w="2600"/>
-            <w:shd w:fill="F2F4F7"/>
-            <w:vAlign w:val="center"/>
-          </w:tcPr>
-          <w:p>
-            <w:pPr>
-              <w:spacing w:after="60" w:before="60"/>
-              <w:jc w:val="left"/>
-            </w:pPr>
-            <w:r>
-              <w:rPr>
-                <w:rFonts w:ascii="Malgun Gothic" w:hAnsi="Malgun Gothic" w:eastAsia="Malgun Gothic"/>
-                <w:b/>
-                <w:color w:val="29465F"/>
-                <w:sz w:val="19"/>
-              </w:rPr>
-              <w:t>참고할 운영 방식</w:t>
-            </w:r>
-          </w:p>
-        </w:tc>
-        <w:tc>
-          <w:tcPr>
-            <w:tcW w:type="dxa" w:w="6760"/>
-            <w:vAlign w:val="center"/>
-          </w:tcPr>
-          <w:p>
-            <w:pPr>
-              <w:spacing w:after="60" w:before="60"/>
-              <w:jc w:val="left"/>
-            </w:pPr>
-            <w:r>
-              <w:rPr>
-                <w:rFonts w:ascii="Malgun Gothic" w:hAnsi="Malgun Gothic" w:eastAsia="Malgun Gothic"/>
-                <w:b w:val="0"/>
-                <w:color w:val="6A7D90"/>
-                <w:sz w:val="19"/>
-              </w:rPr>
-              <w:t>[우리 업무에 적용 전 검토할 점]</w:t>
-            </w:r>
-          </w:p>
-        </w:tc>
-      </w:tr>
-      <w:tr>
-        <w:tc>
-          <w:tcPr>
-            <w:tcW w:type="dxa" w:w="2600"/>
-            <w:shd w:fill="F2F4F7"/>
-            <w:vAlign w:val="center"/>
-          </w:tcPr>
-          <w:p>
-            <w:pPr>
-              <w:spacing w:after="60" w:before="60"/>
-              <w:jc w:val="left"/>
-            </w:pPr>
-            <w:r>
-              <w:rPr>
-                <w:rFonts w:ascii="Malgun Gothic" w:hAnsi="Malgun Gothic" w:eastAsia="Malgun Gothic"/>
-                <w:b/>
-                <w:color w:val="29465F"/>
-                <w:sz w:val="19"/>
-              </w:rPr>
-              <w:t>담당자 확인 필요 사항</w:t>
-            </w:r>
-          </w:p>
-        </w:tc>
-        <w:tc>
-          <w:tcPr>
-            <w:tcW w:type="dxa" w:w="6760"/>
-            <w:vAlign w:val="center"/>
-          </w:tcPr>
-          <w:p>
-            <w:pPr>
-              <w:spacing w:after="60" w:before="60"/>
-              <w:jc w:val="left"/>
-            </w:pPr>
-            <w:r>
-              <w:rPr>
-                <w:rFonts w:ascii="Malgun Gothic" w:hAnsi="Malgun Gothic" w:eastAsia="Malgun Gothic"/>
-                <w:b w:val="0"/>
-                <w:color w:val="6A7D90"/>
-                <w:sz w:val="19"/>
-              </w:rPr>
-              <w:t>[내부 기준·최신성·권한 확인]</w:t>
-            </w:r>
-          </w:p>
-        </w:tc>
-      </w:tr>
-    </w:tbl>
+    <w:p>
+      <w:pPr>
+        <w:spacing w:after="60"/>
+        <w:ind w:left="259"/>
+      </w:pPr>
+      <w:r>
+        <w:rPr>
+          <w:rFonts w:ascii="Malgun Gothic" w:hAnsi="Malgun Gothic" w:eastAsia="Malgun Gothic"/>
+          <w:b w:val="0"/>
+          <w:sz w:val="21"/>
+        </w:rPr>
+        <w:t xml:space="preserve">  나. 우리 대학 적용 전 확인 사항: ○○</w:t>
+      </w:r>
+    </w:p>
+    <w:p>
+      <w:pPr>
+        <w:spacing w:before="160"/>
+      </w:pPr>
+      <w:r>
+        <w:rPr>
+          <w:rFonts w:ascii="Malgun Gothic" w:hAnsi="Malgun Gothic" w:eastAsia="Malgun Gothic"/>
+          <w:b w:val="0"/>
+          <w:sz w:val="21"/>
+        </w:rPr>
+        <w:t>붙임  1. 관련 공개자료 출처 목록 1부.  끝.</w:t>
+      </w:r>
+    </w:p>
     <w:sectPr>
-      <w:headerReference w:type="default" r:id="rId9"/>
-      <w:footerReference w:type="default" r:id="rId10"/>
+      <w:footerReference w:type="default" r:id="rId9"/>
       <w:pgSz w:w="12240" w:h="15840"/>
-      <w:pgMar w:top="1037" w:right="1123" w:bottom="1008" w:left="1123" w:header="432" w:footer="504" w:gutter="0"/>
+      <w:pgMar w:top="1037" w:right="1181" w:bottom="1008" w:left="1181" w:header="720" w:footer="720" w:gutter="0"/>
       <w:cols w:space="720"/>
       <w:docGrid w:linePitch="360"/>
     </w:sectPr>
@@ -1276,37 +557,18 @@
   <w:p>
     <w:pPr>
       <w:pStyle w:val="Footer"/>
-      <w:jc w:val="center"/>
+      <w:jc w:val="right"/>
     </w:pPr>
     <w:r>
       <w:rPr>
         <w:rFonts w:ascii="Malgun Gothic" w:hAnsi="Malgun Gothic" w:eastAsia="Malgun Gothic"/>
-        <w:color w:val="71859A"/>
-        <w:sz w:val="16"/>
-      </w:rPr>
-      <w:t>교육용 참고 양식 · 실제 업무 적용 전 최신 공식 기준과 담당자 확인 필요</w:t>
+        <w:b w:val="0"/>
+        <w:sz w:val="17"/>
+      </w:rPr>
+      <w:t>담당부서 ○○과  |  담당자 ○○○  |  연락처 ○○○-○○○○-○○○○</w:t>
     </w:r>
   </w:p>
 </w:ftr>
-</file>
-
-<file path=word/header1.xml><?xml version="1.0" encoding="utf-8"?>
-<w:hdr xmlns:m="http://schemas.openxmlformats.org/officeDocument/2006/math" xmlns:mc="http://schemas.openxmlformats.org/markup-compatibility/2006" xmlns:mo="http://schemas.microsoft.com/office/mac/office/2008/main" xmlns:mv="urn:schemas-microsoft-com:mac:vml" xmlns:o="urn:schemas-microsoft-com:office:office" xmlns:r="http://schemas.openxmlformats.org/officeDocument/2006/relationships" xmlns:v="urn:schemas-microsoft-com:vml" xmlns:w10="urn:schemas-microsoft-com:office:word" xmlns:w14="http://schemas.microsoft.com/office/word/2010/wordml" xmlns:w="http://schemas.openxmlformats.org/wordprocessingml/2006/main" xmlns:wne="http://schemas.microsoft.com/office/word/2006/wordml" xmlns:wp14="http://schemas.microsoft.com/office/word/2010/wordprocessingDrawing" xmlns:wp="http://schemas.openxmlformats.org/drawingml/2006/wordprocessingDrawing" xmlns:wpc="http://schemas.microsoft.com/office/word/2010/wordprocessingCanvas" xmlns:wpg="http://schemas.microsoft.com/office/word/2010/wordprocessingGroup" xmlns:wpi="http://schemas.microsoft.com/office/word/2010/wordprocessingInk" xmlns:wps="http://schemas.microsoft.com/office/word/2010/wordprocessingShape" mc:Ignorable="w14 wp14">
-  <w:p>
-    <w:pPr>
-      <w:pStyle w:val="Header"/>
-      <w:jc w:val="right"/>
-    </w:pPr>
-    <w:r>
-      <w:rPr>
-        <w:rFonts w:ascii="Malgun Gothic" w:hAnsi="Malgun Gothic" w:eastAsia="Malgun Gothic"/>
-        <w:color w:val="607891"/>
-        <w:sz w:val="16"/>
-      </w:rPr>
-      <w:t>AI WORKFLOW PRACTICE  |  외부 공개자료 기반 문서 양식</w:t>
-    </w:r>
-  </w:p>
-</w:hdr>
 </file>
 
 <file path=word/numbering.xml><?xml version="1.0" encoding="utf-8"?>
@@ -1673,7 +935,7 @@
     <w:qFormat/>
     <w:rsid w:val="00FC693F"/>
     <w:pPr>
-      <w:spacing w:after="120" w:line="288" w:lineRule="auto"/>
+      <w:spacing w:after="80" w:line="276" w:lineRule="auto"/>
     </w:pPr>
     <w:rPr>
       <w:rFonts w:ascii="Malgun Gothic" w:hAnsi="Malgun Gothic" w:eastAsia="Malgun Gothic"/>
@@ -1735,14 +997,14 @@
     <w:pPr>
       <w:keepNext/>
       <w:keepLines/>
-      <w:spacing w:before="240" w:after="100"/>
+      <w:spacing w:before="480" w:after="0"/>
       <w:outlineLvl w:val="0"/>
     </w:pPr>
     <w:rPr>
-      <w:rFonts w:asciiTheme="majorHAnsi" w:eastAsiaTheme="majorEastAsia" w:hAnsiTheme="majorHAnsi" w:cstheme="majorBidi" w:ascii="Malgun Gothic" w:hAnsi="Malgun Gothic" w:eastAsia="Malgun Gothic"/>
+      <w:rFonts w:asciiTheme="majorHAnsi" w:eastAsiaTheme="majorEastAsia" w:hAnsiTheme="majorHAnsi" w:cstheme="majorBidi"/>
       <w:b/>
       <w:bCs/>
-      <w:color w:val="07509F"/>
+      <w:color w:val="365F91" w:themeColor="accent1" w:themeShade="BF"/>
       <w:sz w:val="28"/>
       <w:szCs w:val="28"/>
     </w:rPr>
@@ -1759,15 +1021,15 @@
     <w:pPr>
       <w:keepNext/>
       <w:keepLines/>
-      <w:spacing w:before="240" w:after="100"/>
+      <w:spacing w:before="200" w:after="0"/>
       <w:outlineLvl w:val="1"/>
     </w:pPr>
     <w:rPr>
-      <w:rFonts w:asciiTheme="majorHAnsi" w:eastAsiaTheme="majorEastAsia" w:hAnsiTheme="majorHAnsi" w:cstheme="majorBidi" w:ascii="Malgun Gothic" w:hAnsi="Malgun Gothic" w:eastAsia="Malgun Gothic"/>
+      <w:rFonts w:asciiTheme="majorHAnsi" w:eastAsiaTheme="majorEastAsia" w:hAnsiTheme="majorHAnsi" w:cstheme="majorBidi"/>
       <w:b/>
       <w:bCs/>
-      <w:color w:val="06366F"/>
-      <w:sz w:val="23"/>
+      <w:color w:val="4F81BD" w:themeColor="accent1"/>
+      <w:sz w:val="26"/>
       <w:szCs w:val="26"/>
     </w:rPr>
   </w:style>

</xml_diff>